<commit_message>
docs: sync Q1 paper with latest figures
</commit_message>
<xml_diff>
--- a/outputs/第一问论文_销量分布与相互关系.docx
+++ b/outputs/第一问论文_销量分布与相互关系.docx
@@ -338,7 +338,7 @@
                 <w:color w:val="17212B"/>
                 <w:sz w:val="20"/>
               </w:rPr>
-              <w:t>基于项目当前结果与 71 项一致性验证</w:t>
+              <w:t>基于项目当前结果与 69 项一致性验证</w:t>
             </w:r>
           </w:p>
         </w:tc>
@@ -4837,7 +4837,7 @@
       <w:r>
         <w:drawing>
           <wp:inline xmlns:a="http://schemas.openxmlformats.org/drawingml/2006/main" xmlns:pic="http://schemas.openxmlformats.org/drawingml/2006/picture">
-            <wp:extent cx="5652000" cy="2983639"/>
+            <wp:extent cx="5652000" cy="3151947"/>
             <wp:docPr id="2" name="Picture 2"/>
             <wp:cNvGraphicFramePr>
               <a:graphicFrameLocks noChangeAspect="1"/>
@@ -4858,7 +4858,7 @@
                   <pic:spPr>
                     <a:xfrm>
                       <a:off x="0" y="0"/>
-                      <a:ext cx="5652000" cy="2983639"/>
+                      <a:ext cx="5652000" cy="3151947"/>
                     </a:xfrm>
                     <a:prstGeom prst="rect"/>
                   </pic:spPr>
@@ -4883,7 +4883,7 @@
           <w:color w:val="000000"/>
           <w:sz w:val="19"/>
         </w:rPr>
-        <w:t>图 2  六品类的两部分布组成与正销量最佳参数族</w:t>
+        <w:t>图 2  六品类正销量的对数尺度分布与离散程度</w:t>
       </w:r>
     </w:p>
     <w:p>
@@ -6508,7 +6508,7 @@
       <w:r>
         <w:drawing>
           <wp:inline xmlns:a="http://schemas.openxmlformats.org/drawingml/2006/main" xmlns:pic="http://schemas.openxmlformats.org/drawingml/2006/picture">
-            <wp:extent cx="5652000" cy="3014793"/>
+            <wp:extent cx="5652000" cy="3109001"/>
             <wp:docPr id="3" name="Picture 3"/>
             <wp:cNvGraphicFramePr>
               <a:graphicFrameLocks noChangeAspect="1"/>
@@ -6529,7 +6529,7 @@
                   <pic:spPr>
                     <a:xfrm>
                       <a:off x="0" y="0"/>
-                      <a:ext cx="5652000" cy="3014793"/>
+                      <a:ext cx="5652000" cy="3109001"/>
                     </a:xfrm>
                     <a:prstGeom prst="rect"/>
                   </pic:spPr>
@@ -6554,7 +6554,7 @@
           <w:color w:val="000000"/>
           <w:sz w:val="19"/>
         </w:rPr>
-        <w:t>图 3  k=2—8 的内部指标与年度块重采样稳定性</w:t>
+        <w:t>图 3  k=2—8 的多指标综合比较与 k=5 选择依据</w:t>
       </w:r>
     </w:p>
     <w:p>
@@ -9303,7 +9303,7 @@
       <w:r>
         <w:drawing>
           <wp:inline xmlns:a="http://schemas.openxmlformats.org/drawingml/2006/main" xmlns:pic="http://schemas.openxmlformats.org/drawingml/2006/picture">
-            <wp:extent cx="5652000" cy="3353859"/>
+            <wp:extent cx="5652000" cy="2919360"/>
             <wp:docPr id="4" name="Picture 4"/>
             <wp:cNvGraphicFramePr>
               <a:graphicFrameLocks noChangeAspect="1"/>
@@ -9324,7 +9324,7 @@
                   <pic:spPr>
                     <a:xfrm>
                       <a:off x="0" y="0"/>
-                      <a:ext cx="5652000" cy="3353859"/>
+                      <a:ext cx="5652000" cy="2919360"/>
                     </a:xfrm>
                     <a:prstGeom prst="rect"/>
                   </pic:spPr>
@@ -9349,7 +9349,7 @@
           <w:color w:val="000000"/>
           <w:sz w:val="19"/>
         </w:rPr>
-        <w:t>图 4  五个季节型簇的月度季节指数画像</w:t>
+        <w:t>图 4  五个季节型簇的季节指数与销售活跃率双画像</w:t>
       </w:r>
     </w:p>
     <w:p>
@@ -9690,7 +9690,7 @@
       <w:r>
         <w:drawing>
           <wp:inline xmlns:a="http://schemas.openxmlformats.org/drawingml/2006/main" xmlns:pic="http://schemas.openxmlformats.org/drawingml/2006/picture">
-            <wp:extent cx="5652000" cy="2900769"/>
+            <wp:extent cx="5652000" cy="3211025"/>
             <wp:docPr id="5" name="Picture 5"/>
             <wp:cNvGraphicFramePr>
               <a:graphicFrameLocks noChangeAspect="1"/>
@@ -9711,7 +9711,7 @@
                   <pic:spPr>
                     <a:xfrm>
                       <a:off x="0" y="0"/>
-                      <a:ext cx="5652000" cy="2900769"/>
+                      <a:ext cx="5652000" cy="3211025"/>
                     </a:xfrm>
                     <a:prstGeom prst="rect"/>
                   </pic:spPr>
@@ -9736,7 +9736,7 @@
           <w:color w:val="000000"/>
           <w:sz w:val="19"/>
         </w:rPr>
-        <w:t>图 5  六品类分季节销量相关矩阵</w:t>
+        <w:t>图 5  六品类月度季节指数曲线</w:t>
       </w:r>
     </w:p>
     <w:p>
@@ -9765,7 +9765,7 @@
       <w:r>
         <w:drawing>
           <wp:inline xmlns:a="http://schemas.openxmlformats.org/drawingml/2006/main" xmlns:pic="http://schemas.openxmlformats.org/drawingml/2006/picture">
-            <wp:extent cx="5652000" cy="2956830"/>
+            <wp:extent cx="5652000" cy="2912818"/>
             <wp:docPr id="6" name="Picture 6"/>
             <wp:cNvGraphicFramePr>
               <a:graphicFrameLocks noChangeAspect="1"/>
@@ -9786,7 +9786,7 @@
                   <pic:spPr>
                     <a:xfrm>
                       <a:off x="0" y="0"/>
-                      <a:ext cx="5652000" cy="2956830"/>
+                      <a:ext cx="5652000" cy="2912818"/>
                     </a:xfrm>
                     <a:prstGeom prst="rect"/>
                   </pic:spPr>
@@ -9811,7 +9811,7 @@
           <w:color w:val="000000"/>
           <w:sz w:val="19"/>
         </w:rPr>
-        <w:t>图 6  五个季节簇的销量与份额关系矩阵</w:t>
+        <w:t>图 6  品类与季节簇的总量共变及份额竞争矩阵</w:t>
       </w:r>
     </w:p>
     <w:p>
@@ -9965,7 +9965,7 @@
       <w:r>
         <w:drawing>
           <wp:inline xmlns:a="http://schemas.openxmlformats.org/drawingml/2006/main" xmlns:pic="http://schemas.openxmlformats.org/drawingml/2006/picture">
-            <wp:extent cx="5652000" cy="2885949"/>
+            <wp:extent cx="5652000" cy="2972726"/>
             <wp:docPr id="7" name="Picture 7"/>
             <wp:cNvGraphicFramePr>
               <a:graphicFrameLocks noChangeAspect="1"/>
@@ -9986,7 +9986,7 @@
                   <pic:spPr>
                     <a:xfrm>
                       <a:off x="0" y="0"/>
-                      <a:ext cx="5652000" cy="2885949"/>
+                      <a:ext cx="5652000" cy="2972726"/>
                     </a:xfrm>
                     <a:prstGeom prst="rect"/>
                   </pic:spPr>
@@ -10078,7 +10078,7 @@
           <w:color w:val="000000"/>
           <w:sz w:val="21"/>
         </w:rPr>
-        <w:t>块 Bootstrap 保留了周内连续性，比逐日独立重采样更符合生鲜销量的自相关结构；BH 校正控制同一指标组内的错误发现率，降低 2016 对多重比较造成的偶然显著。全部相关系数位于 [−1,1]、Jaccard 位于 [0,1]；15 个品类对、10 个簇间对和 2016 个单品对数量与组合数完全一致。输出验证共执行 71 项检查，71 项全部通过。</w:t>
+        <w:t>块 Bootstrap 保留了周内连续性，比逐日独立重采样更符合生鲜销量的自相关结构；BH 校正控制同一指标组内的错误发现率，降低 2016 对多重比较造成的偶然显著。全部相关系数位于 [−1,1]、Jaccard 位于 [0,1]；15 个品类对、10 个簇间对和 2016 个单品对数量与组合数完全一致。输出验证共执行 69 项检查，69 项全部通过。</w:t>
       </w:r>
     </w:p>
     <w:p>
@@ -10220,7 +10220,7 @@
           <w:color w:val="000000"/>
           <w:sz w:val="21"/>
         </w:rPr>
-        <w:t>7 日块 Bootstrap 给出 95% 区间，BH 方法控制 FDR；最终只有 18/2016=0.89% 的单品对被标记为较明确，说明阈值没有为了制造结论而放宽。项目级 71 项验证全部通过，关键数字可从 CSV/JSON 追溯。</w:t>
+        <w:t>7 日块 Bootstrap 给出 95% 区间，BH 方法控制 FDR；最终只有 18/2016=0.89% 的单品对被标记为较明确，说明阈值没有为了制造结论而放宽。项目级 69 项验证全部通过，关键数字可从 CSV/JSON 追溯。</w:t>
       </w:r>
     </w:p>
     <w:p>
@@ -10894,7 +10894,7 @@
                 <w:color w:val="000000"/>
                 <w:sz w:val="18"/>
               </w:rPr>
-              <w:t>8  输出完整关系母表、代表性图表和 q1_summary.json；运行 71 项一致性验证</w:t>
+              <w:t>8  输出完整关系母表、代表性图表和 q1_summary.json；运行 69 项一致性验证</w:t>
             </w:r>
           </w:p>
         </w:tc>

</xml_diff>